<commit_message>
Update Level 2 submission docs with embedded charts, demo video, and metrics UI
</commit_message>
<xml_diff>
--- a/Tireless_Hand_Level2_Submission.docx
+++ b/Tireless_Hand_Level2_Submission.docx
@@ -10,20 +10,20 @@
         <w:rPr>
           <w:b/>
           <w:color w:val="0F172A"/>
-          <w:sz w:val="48"/>
+          <w:sz w:val="44"/>
         </w:rPr>
-        <w:t>Tireless Hand — Evaluation Submission</w:t>
+        <w:t>Tireless Hand — Evaluation Submission Document</w:t>
       </w:r>
     </w:p>
     <w:p>
       <w:pPr>
-        <w:spacing w:after="280"/>
+        <w:spacing w:after="240"/>
       </w:pPr>
       <w:r>
         <w:rPr>
           <w:b/>
           <w:color w:val="0284C7"/>
-          <w:sz w:val="26"/>
+          <w:sz w:val="25"/>
         </w:rPr>
         <w:t>Level 2: Getting Into Your Domain — Performance &amp; Real-Time Telemetry Reliability Testing</w:t>
       </w:r>
@@ -35,13 +35,13 @@
         <w:tblLook w:firstColumn="1" w:firstRow="1" w:lastColumn="0" w:lastRow="0" w:noHBand="0" w:noVBand="1" w:val="04A0"/>
       </w:tblPr>
       <w:tblGrid>
-        <w:gridCol w:w="4968"/>
-        <w:gridCol w:w="4968"/>
+        <w:gridCol w:w="5040"/>
+        <w:gridCol w:w="5040"/>
       </w:tblGrid>
       <w:tr>
         <w:tc>
           <w:tcPr>
-            <w:tcW w:type="dxa" w:w="4968"/>
+            <w:tcW w:type="dxa" w:w="5040"/>
             <w:shd w:fill="F1F5F9"/>
           </w:tcPr>
           <w:p>
@@ -52,14 +52,14 @@
               <w:rPr>
                 <w:b/>
                 <w:color w:val="475569"/>
-                <w:sz w:val="19"/>
+                <w:sz w:val="18"/>
               </w:rPr>
               <w:t xml:space="preserve">Project Name: </w:t>
             </w:r>
             <w:r>
               <w:rPr>
                 <w:b w:val="0"/>
-                <w:sz w:val="19"/>
+                <w:sz w:val="18"/>
               </w:rPr>
               <w:t>Tireless Hand (Autonomous UI &amp; Reliability Agent)</w:t>
             </w:r>
@@ -67,7 +67,7 @@
         </w:tc>
         <w:tc>
           <w:tcPr>
-            <w:tcW w:type="dxa" w:w="4968"/>
+            <w:tcW w:type="dxa" w:w="5040"/>
             <w:shd w:fill="F1F5F9"/>
           </w:tcPr>
           <w:p>
@@ -78,14 +78,14 @@
               <w:rPr>
                 <w:b/>
                 <w:color w:val="475569"/>
-                <w:sz w:val="19"/>
+                <w:sz w:val="18"/>
               </w:rPr>
               <w:t xml:space="preserve">Category: </w:t>
             </w:r>
             <w:r>
               <w:rPr>
                 <w:b w:val="0"/>
-                <w:sz w:val="19"/>
+                <w:sz w:val="18"/>
               </w:rPr>
               <w:t>Level 2: Performance &amp; Complex Domain Testing</w:t>
             </w:r>
@@ -95,7 +95,7 @@
       <w:tr>
         <w:tc>
           <w:tcPr>
-            <w:tcW w:type="dxa" w:w="4968"/>
+            <w:tcW w:type="dxa" w:w="5040"/>
             <w:shd w:fill="F1F5F9"/>
           </w:tcPr>
           <w:p>
@@ -106,14 +106,14 @@
               <w:rPr>
                 <w:b/>
                 <w:color w:val="475569"/>
-                <w:sz w:val="19"/>
+                <w:sz w:val="18"/>
               </w:rPr>
               <w:t xml:space="preserve">Target Platform: </w:t>
             </w:r>
             <w:r>
               <w:rPr>
                 <w:b w:val="0"/>
-                <w:sz w:val="19"/>
+                <w:sz w:val="18"/>
               </w:rPr>
               <w:t>FlytBase Drone Operations &amp; Mission Control</w:t>
             </w:r>
@@ -121,7 +121,7 @@
         </w:tc>
         <w:tc>
           <w:tcPr>
-            <w:tcW w:type="dxa" w:w="4968"/>
+            <w:tcW w:type="dxa" w:w="5040"/>
             <w:shd w:fill="F1F5F9"/>
           </w:tcPr>
           <w:p>
@@ -132,7 +132,7 @@
               <w:rPr>
                 <w:b/>
                 <w:color w:val="475569"/>
-                <w:sz w:val="19"/>
+                <w:sz w:val="18"/>
               </w:rPr>
               <w:t xml:space="preserve">Evaluation Metric: </w:t>
             </w:r>
@@ -140,7 +140,7 @@
               <w:rPr>
                 <w:b/>
                 <w:color w:val="10B981"/>
-                <w:sz w:val="19"/>
+                <w:sz w:val="18"/>
               </w:rPr>
               <w:t>100% Precision | 100% Recall | 1.000 F1-Score</w:t>
             </w:r>
@@ -155,7 +155,7 @@
     </w:p>
     <w:p>
       <w:pPr>
-        <w:spacing w:before="240" w:after="120"/>
+        <w:spacing w:before="200" w:after="120"/>
       </w:pPr>
       <w:r>
         <w:rPr>
@@ -168,7 +168,63 @@
     </w:p>
     <w:p>
       <w:r>
-        <w:t>Tireless Hand Level 2 extends our autonomous testing architecture to deeply audit domain-specific constraints in drone fleet operations: high-frequency WebSocket telemetry streams, rendering stability of 3D globe maps (Cesium/WebGL), main-thread UI responsiveness during emergency commands, and long-term memory stability under continuous data streaming.</w:t>
+        <w:t>Tireless Hand Level 2 extends autonomous testing into deep domain-specific constraints in drone fleet operations: high-frequency WebSocket telemetry streaming, rendering performance of 3D globe canvases (Cesium/WebGL), main-thread UI responsiveness during emergency pilot commands, and sustained memory stability under continuous telemetry polling.</w:t>
+      </w:r>
+    </w:p>
+    <w:p>
+      <w:pPr>
+        <w:spacing w:before="120" w:after="40"/>
+        <w:jc w:val="center"/>
+      </w:pPr>
+    </w:p>
+    <w:p>
+      <w:r>
+        <w:drawing>
+          <wp:inline xmlns:a="http://schemas.openxmlformats.org/drawingml/2006/main" xmlns:pic="http://schemas.openxmlformats.org/drawingml/2006/picture">
+            <wp:extent cx="5669280" cy="2519680"/>
+            <wp:docPr id="1" name="Picture 1"/>
+            <wp:cNvGraphicFramePr>
+              <a:graphicFrameLocks noChangeAspect="1"/>
+            </wp:cNvGraphicFramePr>
+            <a:graphic>
+              <a:graphicData uri="http://schemas.openxmlformats.org/drawingml/2006/picture">
+                <pic:pic>
+                  <pic:nvPicPr>
+                    <pic:cNvPr id="0" name="level2_architecture.png"/>
+                    <pic:cNvPicPr/>
+                  </pic:nvPicPr>
+                  <pic:blipFill>
+                    <a:blip r:embed="rId9"/>
+                    <a:stretch>
+                      <a:fillRect/>
+                    </a:stretch>
+                  </pic:blipFill>
+                  <pic:spPr>
+                    <a:xfrm>
+                      <a:off x="0" y="0"/>
+                      <a:ext cx="5669280" cy="2519680"/>
+                    </a:xfrm>
+                    <a:prstGeom prst="rect"/>
+                  </pic:spPr>
+                </pic:pic>
+              </a:graphicData>
+            </a:graphic>
+          </wp:inline>
+        </w:drawing>
+      </w:r>
+    </w:p>
+    <w:p>
+      <w:pPr>
+        <w:spacing w:after="200"/>
+        <w:jc w:val="center"/>
+      </w:pPr>
+      <w:r>
+        <w:rPr>
+          <w:i/>
+          <w:color w:val="64748B"/>
+          <w:sz w:val="17"/>
+        </w:rPr>
+        <w:t>Figure 1.1: Tireless Hand Level 2 Autonomous Performance &amp; Telemetry Architecture</w:t>
       </w:r>
     </w:p>
     <w:p>
@@ -176,12 +232,12 @@
         <w:pStyle w:val="Heading2"/>
       </w:pPr>
       <w:r>
-        <w:t>Key Architectural Pillars of Level 2 Performance Auditor:</w:t>
+        <w:t>Core Architectural Pillars:</w:t>
       </w:r>
     </w:p>
     <w:p>
       <w:pPr>
-        <w:spacing w:after="80"/>
+        <w:spacing w:after="60"/>
         <w:ind w:left="288"/>
       </w:pPr>
       <w:r>
@@ -189,15 +245,15 @@
           <w:b/>
           <w:color w:val="0284C7"/>
         </w:rPr>
-        <w:t xml:space="preserve">• 1. In-Flight Zero-Overhead Instrumentation: </w:t>
+        <w:t xml:space="preserve">• 1. In-Flight Zero-Overhead Observers: </w:t>
       </w:r>
       <w:r>
-        <w:t>Pre-navigation script injection registers non-blocking PerformanceObserver hooks for Core Web Vitals (LCP, CLS) and Long Tasks (&gt;50ms) before initial DOM construction.</w:t>
+        <w:t>Pre-navigation script injection registers non-blocking PerformanceObserver hooks for Core Web Vitals (LCP, CLS) and Long Tasks (&gt;50ms) prior to DOM construction.</w:t>
       </w:r>
     </w:p>
     <w:p>
       <w:pPr>
-        <w:spacing w:after="80"/>
+        <w:spacing w:after="60"/>
         <w:ind w:left="288"/>
       </w:pPr>
       <w:r>
@@ -205,15 +261,15 @@
           <w:b/>
           <w:color w:val="0284C7"/>
         </w:rPr>
-        <w:t xml:space="preserve">• 2. High-Precision Frame Rate Profiling: </w:t>
+        <w:t xml:space="preserve">• 2. High-Precision Frame Rate Profiler: </w:t>
       </w:r>
       <w:r>
-        <w:t>Maintains a lightweight requestAnimationFrame loop monitoring 60 FPS animation smoothness, rendering jitter, and 3D WebGL canvas frame drops without distorting test metrics.</w:t>
+        <w:t>Maintains a lightweight requestAnimationFrame loop monitoring 60 FPS animation smoothness, rendering jitter, and 3D WebGL canvas frame drops.</w:t>
       </w:r>
     </w:p>
     <w:p>
       <w:pPr>
-        <w:spacing w:after="80"/>
+        <w:spacing w:after="60"/>
         <w:ind w:left="288"/>
       </w:pPr>
       <w:r>
@@ -221,15 +277,15 @@
           <w:b/>
           <w:color w:val="0284C7"/>
         </w:rPr>
-        <w:t xml:space="preserve">• 3. Main-Thread Long Task &amp; TBT Analysis: </w:t>
+        <w:t xml:space="preserve">• 3. Main-Thread Long Task &amp; TBT Analyzer: </w:t>
       </w:r>
       <w:r>
-        <w:t>Identifies synchronous JavaScript bottlenecks (e.g. unoptimized IMU matrix calculations) that lock the browser event loop and delay critical pilot commands like Return-To-Home (RTH).</w:t>
+        <w:t>Identifies synchronous JavaScript bottlenecks (e.g. unoptimized IMU matrix transforms) that freeze emergency flight controls like Return-To-Home (RTH).</w:t>
       </w:r>
     </w:p>
     <w:p>
       <w:pPr>
-        <w:spacing w:after="80"/>
+        <w:spacing w:after="60"/>
         <w:ind w:left="288"/>
       </w:pPr>
       <w:r>
@@ -237,10 +293,10 @@
           <w:b/>
           <w:color w:val="0284C7"/>
         </w:rPr>
-        <w:t xml:space="preserve">• 4. Sustained Stream Memory Leak Tracking: </w:t>
+        <w:t xml:space="preserve">• 4. Sustained Stream Memory Leak Profiler: </w:t>
       </w:r>
       <w:r>
-        <w:t>Samples JavaScript heap allocation (usedJSHeapSize) across active operational windows to detect memory growth (&gt;15MB) from uncollected WebSocket subscriptions and retained flight path geometry.</w:t>
+        <w:t>Continuously samples JavaScript heap allocation (usedJSHeapSize) across active windows to catch unbounded memory growth (&gt;15MB) from uncollected WebSocket listeners.</w:t>
       </w:r>
     </w:p>
     <w:p>
@@ -253,12 +309,68 @@
           <w:color w:val="0F172A"/>
           <w:sz w:val="32"/>
         </w:rPr>
-        <w:t>Part 2: Scenarios &amp; Failure Modes</w:t>
+        <w:t>Part 2: Scenarios &amp; Failure Mode Analysis</w:t>
       </w:r>
     </w:p>
     <w:p>
       <w:r>
         <w:t>Tireless Hand evaluated eight performance and domain scenarios (four production baselines and four injected domain mutations) with 100% precision and zero false alarms.</w:t>
+      </w:r>
+    </w:p>
+    <w:p>
+      <w:pPr>
+        <w:spacing w:before="120" w:after="40"/>
+        <w:jc w:val="center"/>
+      </w:pPr>
+    </w:p>
+    <w:p>
+      <w:r>
+        <w:drawing>
+          <wp:inline xmlns:a="http://schemas.openxmlformats.org/drawingml/2006/main" xmlns:pic="http://schemas.openxmlformats.org/drawingml/2006/picture">
+            <wp:extent cx="5486400" cy="3086100"/>
+            <wp:docPr id="2" name="Picture 2"/>
+            <wp:cNvGraphicFramePr>
+              <a:graphicFrameLocks noChangeAspect="1"/>
+            </wp:cNvGraphicFramePr>
+            <a:graphic>
+              <a:graphicData uri="http://schemas.openxmlformats.org/drawingml/2006/picture">
+                <pic:pic>
+                  <pic:nvPicPr>
+                    <pic:cNvPr id="0" name="level2_perf_metrics_chart.png"/>
+                    <pic:cNvPicPr/>
+                  </pic:nvPicPr>
+                  <pic:blipFill>
+                    <a:blip r:embed="rId10"/>
+                    <a:stretch>
+                      <a:fillRect/>
+                    </a:stretch>
+                  </pic:blipFill>
+                  <pic:spPr>
+                    <a:xfrm>
+                      <a:off x="0" y="0"/>
+                      <a:ext cx="5486400" cy="3086100"/>
+                    </a:xfrm>
+                    <a:prstGeom prst="rect"/>
+                  </pic:spPr>
+                </pic:pic>
+              </a:graphicData>
+            </a:graphic>
+          </wp:inline>
+        </w:drawing>
+      </w:r>
+    </w:p>
+    <w:p>
+      <w:pPr>
+        <w:spacing w:after="200"/>
+        <w:jc w:val="center"/>
+      </w:pPr>
+      <w:r>
+        <w:rPr>
+          <w:i/>
+          <w:color w:val="64748B"/>
+          <w:sz w:val="17"/>
+        </w:rPr>
+        <w:t>Figure 2.1: Core Web Vitals &amp; Resource Metrics Comparison (Clean Baseline vs Injected Failures)</w:t>
       </w:r>
     </w:p>
     <w:tbl>
@@ -268,17 +380,17 @@
         <w:tblLook w:firstColumn="1" w:firstRow="1" w:lastColumn="0" w:lastRow="0" w:noHBand="0" w:noVBand="1" w:val="04A0"/>
       </w:tblPr>
       <w:tblGrid>
-        <w:gridCol w:w="1656"/>
-        <w:gridCol w:w="1656"/>
-        <w:gridCol w:w="1656"/>
-        <w:gridCol w:w="1656"/>
-        <w:gridCol w:w="1656"/>
-        <w:gridCol w:w="1656"/>
+        <w:gridCol w:w="1680"/>
+        <w:gridCol w:w="1680"/>
+        <w:gridCol w:w="1680"/>
+        <w:gridCol w:w="1680"/>
+        <w:gridCol w:w="1680"/>
+        <w:gridCol w:w="1680"/>
       </w:tblGrid>
       <w:tr>
         <w:tc>
           <w:tcPr>
-            <w:tcW w:type="dxa" w:w="1656"/>
+            <w:tcW w:type="dxa" w:w="1680"/>
             <w:shd w:fill="0F172A"/>
           </w:tcPr>
           <w:p>
@@ -289,7 +401,7 @@
               <w:rPr>
                 <w:b/>
                 <w:color w:val="F8FAFC"/>
-                <w:sz w:val="18"/>
+                <w:sz w:val="17"/>
               </w:rPr>
               <w:t>Test ID</w:t>
             </w:r>
@@ -297,7 +409,7 @@
         </w:tc>
         <w:tc>
           <w:tcPr>
-            <w:tcW w:type="dxa" w:w="1656"/>
+            <w:tcW w:type="dxa" w:w="1680"/>
             <w:shd w:fill="0F172A"/>
           </w:tcPr>
           <w:p>
@@ -308,7 +420,7 @@
               <w:rPr>
                 <w:b/>
                 <w:color w:val="F8FAFC"/>
-                <w:sz w:val="18"/>
+                <w:sz w:val="17"/>
               </w:rPr>
               <w:t>Scenario Name</w:t>
             </w:r>
@@ -316,7 +428,7 @@
         </w:tc>
         <w:tc>
           <w:tcPr>
-            <w:tcW w:type="dxa" w:w="1656"/>
+            <w:tcW w:type="dxa" w:w="1680"/>
             <w:shd w:fill="0F172A"/>
           </w:tcPr>
           <w:p>
@@ -327,7 +439,7 @@
               <w:rPr>
                 <w:b/>
                 <w:color w:val="F8FAFC"/>
-                <w:sz w:val="18"/>
+                <w:sz w:val="17"/>
               </w:rPr>
               <w:t>Observed Metric</w:t>
             </w:r>
@@ -335,7 +447,7 @@
         </w:tc>
         <w:tc>
           <w:tcPr>
-            <w:tcW w:type="dxa" w:w="1656"/>
+            <w:tcW w:type="dxa" w:w="1680"/>
             <w:shd w:fill="0F172A"/>
           </w:tcPr>
           <w:p>
@@ -346,7 +458,7 @@
               <w:rPr>
                 <w:b/>
                 <w:color w:val="F8FAFC"/>
-                <w:sz w:val="18"/>
+                <w:sz w:val="17"/>
               </w:rPr>
               <w:t>Expected</w:t>
             </w:r>
@@ -354,7 +466,7 @@
         </w:tc>
         <w:tc>
           <w:tcPr>
-            <w:tcW w:type="dxa" w:w="1656"/>
+            <w:tcW w:type="dxa" w:w="1680"/>
             <w:shd w:fill="0F172A"/>
           </w:tcPr>
           <w:p>
@@ -365,7 +477,7 @@
               <w:rPr>
                 <w:b/>
                 <w:color w:val="F8FAFC"/>
-                <w:sz w:val="18"/>
+                <w:sz w:val="17"/>
               </w:rPr>
               <w:t>Detected</w:t>
             </w:r>
@@ -373,7 +485,7 @@
         </w:tc>
         <w:tc>
           <w:tcPr>
-            <w:tcW w:type="dxa" w:w="1656"/>
+            <w:tcW w:type="dxa" w:w="1680"/>
             <w:shd w:fill="0F172A"/>
           </w:tcPr>
           <w:p>
@@ -384,7 +496,7 @@
               <w:rPr>
                 <w:b/>
                 <w:color w:val="F8FAFC"/>
-                <w:sz w:val="18"/>
+                <w:sz w:val="17"/>
               </w:rPr>
               <w:t>Result</w:t>
             </w:r>
@@ -394,7 +506,7 @@
       <w:tr>
         <w:tc>
           <w:tcPr>
-            <w:tcW w:type="dxa" w:w="1656"/>
+            <w:tcW w:type="dxa" w:w="1680"/>
             <w:shd w:fill="F8FAFC"/>
           </w:tcPr>
           <w:p>
@@ -403,7 +515,7 @@
             </w:pPr>
             <w:r>
               <w:rPr>
-                <w:sz w:val="17"/>
+                <w:sz w:val="16"/>
               </w:rPr>
               <w:t>PERF-01</w:t>
             </w:r>
@@ -411,7 +523,7 @@
         </w:tc>
         <w:tc>
           <w:tcPr>
-            <w:tcW w:type="dxa" w:w="1656"/>
+            <w:tcW w:type="dxa" w:w="1680"/>
             <w:shd w:fill="F8FAFC"/>
           </w:tcPr>
           <w:p>
@@ -420,7 +532,7 @@
             </w:pPr>
             <w:r>
               <w:rPr>
-                <w:sz w:val="17"/>
+                <w:sz w:val="16"/>
               </w:rPr>
               <w:t>Clean Drone Cockpit Baseline</w:t>
             </w:r>
@@ -428,7 +540,7 @@
         </w:tc>
         <w:tc>
           <w:tcPr>
-            <w:tcW w:type="dxa" w:w="1656"/>
+            <w:tcW w:type="dxa" w:w="1680"/>
             <w:shd w:fill="F8FAFC"/>
           </w:tcPr>
           <w:p>
@@ -437,7 +549,7 @@
             </w:pPr>
             <w:r>
               <w:rPr>
-                <w:sz w:val="17"/>
+                <w:sz w:val="16"/>
               </w:rPr>
               <w:t>FPS: 9.5 (3D Globe), LCP: 461ms</w:t>
             </w:r>
@@ -445,7 +557,7 @@
         </w:tc>
         <w:tc>
           <w:tcPr>
-            <w:tcW w:type="dxa" w:w="1656"/>
+            <w:tcW w:type="dxa" w:w="1680"/>
             <w:shd w:fill="F8FAFC"/>
           </w:tcPr>
           <w:p>
@@ -454,7 +566,7 @@
             </w:pPr>
             <w:r>
               <w:rPr>
-                <w:sz w:val="17"/>
+                <w:sz w:val="16"/>
               </w:rPr>
               <w:t>Clean</w:t>
             </w:r>
@@ -462,7 +574,7 @@
         </w:tc>
         <w:tc>
           <w:tcPr>
-            <w:tcW w:type="dxa" w:w="1656"/>
+            <w:tcW w:type="dxa" w:w="1680"/>
             <w:shd w:fill="F8FAFC"/>
           </w:tcPr>
           <w:p>
@@ -471,7 +583,7 @@
             </w:pPr>
             <w:r>
               <w:rPr>
-                <w:sz w:val="17"/>
+                <w:sz w:val="16"/>
               </w:rPr>
               <w:t>Clean</w:t>
             </w:r>
@@ -479,7 +591,7 @@
         </w:tc>
         <w:tc>
           <w:tcPr>
-            <w:tcW w:type="dxa" w:w="1656"/>
+            <w:tcW w:type="dxa" w:w="1680"/>
             <w:shd w:fill="F8FAFC"/>
           </w:tcPr>
           <w:p>
@@ -490,7 +602,7 @@
               <w:rPr>
                 <w:b/>
                 <w:color w:val="10B981"/>
-                <w:sz w:val="17"/>
+                <w:sz w:val="16"/>
               </w:rPr>
               <w:t>TN (Pass)</w:t>
             </w:r>
@@ -500,7 +612,7 @@
       <w:tr>
         <w:tc>
           <w:tcPr>
-            <w:tcW w:type="dxa" w:w="1656"/>
+            <w:tcW w:type="dxa" w:w="1680"/>
             <w:shd w:fill="FFFFFF"/>
           </w:tcPr>
           <w:p>
@@ -509,7 +621,7 @@
             </w:pPr>
             <w:r>
               <w:rPr>
-                <w:sz w:val="17"/>
+                <w:sz w:val="16"/>
               </w:rPr>
               <w:t>PERF-02</w:t>
             </w:r>
@@ -517,7 +629,7 @@
         </w:tc>
         <w:tc>
           <w:tcPr>
-            <w:tcW w:type="dxa" w:w="1656"/>
+            <w:tcW w:type="dxa" w:w="1680"/>
             <w:shd w:fill="FFFFFF"/>
           </w:tcPr>
           <w:p>
@@ -526,7 +638,7 @@
             </w:pPr>
             <w:r>
               <w:rPr>
-                <w:sz w:val="17"/>
+                <w:sz w:val="16"/>
               </w:rPr>
               <w:t>Clean FlytBase Control Panel</w:t>
             </w:r>
@@ -534,7 +646,7 @@
         </w:tc>
         <w:tc>
           <w:tcPr>
-            <w:tcW w:type="dxa" w:w="1656"/>
+            <w:tcW w:type="dxa" w:w="1680"/>
             <w:shd w:fill="FFFFFF"/>
           </w:tcPr>
           <w:p>
@@ -543,7 +655,7 @@
             </w:pPr>
             <w:r>
               <w:rPr>
-                <w:sz w:val="17"/>
+                <w:sz w:val="16"/>
               </w:rPr>
               <w:t>58.5 FPS, 0 Long Tasks, Heap OK</w:t>
             </w:r>
@@ -551,7 +663,7 @@
         </w:tc>
         <w:tc>
           <w:tcPr>
-            <w:tcW w:type="dxa" w:w="1656"/>
+            <w:tcW w:type="dxa" w:w="1680"/>
             <w:shd w:fill="FFFFFF"/>
           </w:tcPr>
           <w:p>
@@ -560,7 +672,7 @@
             </w:pPr>
             <w:r>
               <w:rPr>
-                <w:sz w:val="17"/>
+                <w:sz w:val="16"/>
               </w:rPr>
               <w:t>Clean</w:t>
             </w:r>
@@ -568,7 +680,7 @@
         </w:tc>
         <w:tc>
           <w:tcPr>
-            <w:tcW w:type="dxa" w:w="1656"/>
+            <w:tcW w:type="dxa" w:w="1680"/>
             <w:shd w:fill="FFFFFF"/>
           </w:tcPr>
           <w:p>
@@ -577,7 +689,7 @@
             </w:pPr>
             <w:r>
               <w:rPr>
-                <w:sz w:val="17"/>
+                <w:sz w:val="16"/>
               </w:rPr>
               <w:t>Clean</w:t>
             </w:r>
@@ -585,7 +697,7 @@
         </w:tc>
         <w:tc>
           <w:tcPr>
-            <w:tcW w:type="dxa" w:w="1656"/>
+            <w:tcW w:type="dxa" w:w="1680"/>
             <w:shd w:fill="FFFFFF"/>
           </w:tcPr>
           <w:p>
@@ -596,7 +708,7 @@
               <w:rPr>
                 <w:b/>
                 <w:color w:val="10B981"/>
-                <w:sz w:val="17"/>
+                <w:sz w:val="16"/>
               </w:rPr>
               <w:t>TN (Pass)</w:t>
             </w:r>
@@ -606,7 +718,7 @@
       <w:tr>
         <w:tc>
           <w:tcPr>
-            <w:tcW w:type="dxa" w:w="1656"/>
+            <w:tcW w:type="dxa" w:w="1680"/>
             <w:shd w:fill="F8FAFC"/>
           </w:tcPr>
           <w:p>
@@ -615,7 +727,7 @@
             </w:pPr>
             <w:r>
               <w:rPr>
-                <w:sz w:val="17"/>
+                <w:sz w:val="16"/>
               </w:rPr>
               <w:t>PERF-03</w:t>
             </w:r>
@@ -623,7 +735,7 @@
         </w:tc>
         <w:tc>
           <w:tcPr>
-            <w:tcW w:type="dxa" w:w="1656"/>
+            <w:tcW w:type="dxa" w:w="1680"/>
             <w:shd w:fill="F8FAFC"/>
           </w:tcPr>
           <w:p>
@@ -632,7 +744,7 @@
             </w:pPr>
             <w:r>
               <w:rPr>
-                <w:sz w:val="17"/>
+                <w:sz w:val="16"/>
               </w:rPr>
               <w:t>Clean Mission Planner</w:t>
             </w:r>
@@ -640,7 +752,7 @@
         </w:tc>
         <w:tc>
           <w:tcPr>
-            <w:tcW w:type="dxa" w:w="1656"/>
+            <w:tcW w:type="dxa" w:w="1680"/>
             <w:shd w:fill="F8FAFC"/>
           </w:tcPr>
           <w:p>
@@ -649,7 +761,7 @@
             </w:pPr>
             <w:r>
               <w:rPr>
-                <w:sz w:val="17"/>
+                <w:sz w:val="16"/>
               </w:rPr>
               <w:t>59.2 FPS, 0 CLS, Heap OK</w:t>
             </w:r>
@@ -657,7 +769,7 @@
         </w:tc>
         <w:tc>
           <w:tcPr>
-            <w:tcW w:type="dxa" w:w="1656"/>
+            <w:tcW w:type="dxa" w:w="1680"/>
             <w:shd w:fill="F8FAFC"/>
           </w:tcPr>
           <w:p>
@@ -666,7 +778,7 @@
             </w:pPr>
             <w:r>
               <w:rPr>
-                <w:sz w:val="17"/>
+                <w:sz w:val="16"/>
               </w:rPr>
               <w:t>Clean</w:t>
             </w:r>
@@ -674,7 +786,7 @@
         </w:tc>
         <w:tc>
           <w:tcPr>
-            <w:tcW w:type="dxa" w:w="1656"/>
+            <w:tcW w:type="dxa" w:w="1680"/>
             <w:shd w:fill="F8FAFC"/>
           </w:tcPr>
           <w:p>
@@ -683,7 +795,7 @@
             </w:pPr>
             <w:r>
               <w:rPr>
-                <w:sz w:val="17"/>
+                <w:sz w:val="16"/>
               </w:rPr>
               <w:t>Clean</w:t>
             </w:r>
@@ -691,7 +803,7 @@
         </w:tc>
         <w:tc>
           <w:tcPr>
-            <w:tcW w:type="dxa" w:w="1656"/>
+            <w:tcW w:type="dxa" w:w="1680"/>
             <w:shd w:fill="F8FAFC"/>
           </w:tcPr>
           <w:p>
@@ -702,7 +814,7 @@
               <w:rPr>
                 <w:b/>
                 <w:color w:val="10B981"/>
-                <w:sz w:val="17"/>
+                <w:sz w:val="16"/>
               </w:rPr>
               <w:t>TN (Pass)</w:t>
             </w:r>
@@ -712,7 +824,7 @@
       <w:tr>
         <w:tc>
           <w:tcPr>
-            <w:tcW w:type="dxa" w:w="1656"/>
+            <w:tcW w:type="dxa" w:w="1680"/>
             <w:shd w:fill="FFFFFF"/>
           </w:tcPr>
           <w:p>
@@ -721,7 +833,7 @@
             </w:pPr>
             <w:r>
               <w:rPr>
-                <w:sz w:val="17"/>
+                <w:sz w:val="16"/>
               </w:rPr>
               <w:t>PERF-04</w:t>
             </w:r>
@@ -729,7 +841,7 @@
         </w:tc>
         <w:tc>
           <w:tcPr>
-            <w:tcW w:type="dxa" w:w="1656"/>
+            <w:tcW w:type="dxa" w:w="1680"/>
             <w:shd w:fill="FFFFFF"/>
           </w:tcPr>
           <w:p>
@@ -738,7 +850,7 @@
             </w:pPr>
             <w:r>
               <w:rPr>
-                <w:sz w:val="17"/>
+                <w:sz w:val="16"/>
               </w:rPr>
               <w:t>Clean Diagnostics Stream</w:t>
             </w:r>
@@ -746,7 +858,7 @@
         </w:tc>
         <w:tc>
           <w:tcPr>
-            <w:tcW w:type="dxa" w:w="1656"/>
+            <w:tcW w:type="dxa" w:w="1680"/>
             <w:shd w:fill="FFFFFF"/>
           </w:tcPr>
           <w:p>
@@ -755,7 +867,7 @@
             </w:pPr>
             <w:r>
               <w:rPr>
-                <w:sz w:val="17"/>
+                <w:sz w:val="16"/>
               </w:rPr>
               <w:t>59.2 FPS, 0 CLS, Heap OK</w:t>
             </w:r>
@@ -763,7 +875,7 @@
         </w:tc>
         <w:tc>
           <w:tcPr>
-            <w:tcW w:type="dxa" w:w="1656"/>
+            <w:tcW w:type="dxa" w:w="1680"/>
             <w:shd w:fill="FFFFFF"/>
           </w:tcPr>
           <w:p>
@@ -772,7 +884,7 @@
             </w:pPr>
             <w:r>
               <w:rPr>
-                <w:sz w:val="17"/>
+                <w:sz w:val="16"/>
               </w:rPr>
               <w:t>Clean</w:t>
             </w:r>
@@ -780,7 +892,7 @@
         </w:tc>
         <w:tc>
           <w:tcPr>
-            <w:tcW w:type="dxa" w:w="1656"/>
+            <w:tcW w:type="dxa" w:w="1680"/>
             <w:shd w:fill="FFFFFF"/>
           </w:tcPr>
           <w:p>
@@ -789,7 +901,7 @@
             </w:pPr>
             <w:r>
               <w:rPr>
-                <w:sz w:val="17"/>
+                <w:sz w:val="16"/>
               </w:rPr>
               <w:t>Clean</w:t>
             </w:r>
@@ -797,7 +909,7 @@
         </w:tc>
         <w:tc>
           <w:tcPr>
-            <w:tcW w:type="dxa" w:w="1656"/>
+            <w:tcW w:type="dxa" w:w="1680"/>
             <w:shd w:fill="FFFFFF"/>
           </w:tcPr>
           <w:p>
@@ -808,7 +920,7 @@
               <w:rPr>
                 <w:b/>
                 <w:color w:val="10B981"/>
-                <w:sz w:val="17"/>
+                <w:sz w:val="16"/>
               </w:rPr>
               <w:t>TN (Pass)</w:t>
             </w:r>
@@ -818,7 +930,7 @@
       <w:tr>
         <w:tc>
           <w:tcPr>
-            <w:tcW w:type="dxa" w:w="1656"/>
+            <w:tcW w:type="dxa" w:w="1680"/>
             <w:shd w:fill="F8FAFC"/>
           </w:tcPr>
           <w:p>
@@ -827,7 +939,7 @@
             </w:pPr>
             <w:r>
               <w:rPr>
-                <w:sz w:val="17"/>
+                <w:sz w:val="16"/>
               </w:rPr>
               <w:t>PERF-05</w:t>
             </w:r>
@@ -835,7 +947,7 @@
         </w:tc>
         <w:tc>
           <w:tcPr>
-            <w:tcW w:type="dxa" w:w="1656"/>
+            <w:tcW w:type="dxa" w:w="1680"/>
             <w:shd w:fill="F8FAFC"/>
           </w:tcPr>
           <w:p>
@@ -844,7 +956,7 @@
             </w:pPr>
             <w:r>
               <w:rPr>
-                <w:sz w:val="17"/>
+                <w:sz w:val="16"/>
               </w:rPr>
               <w:t>Heavy Flight Map (High LCP)</w:t>
             </w:r>
@@ -852,7 +964,7 @@
         </w:tc>
         <w:tc>
           <w:tcPr>
-            <w:tcW w:type="dxa" w:w="1656"/>
+            <w:tcW w:type="dxa" w:w="1680"/>
             <w:shd w:fill="F8FAFC"/>
           </w:tcPr>
           <w:p>
@@ -861,7 +973,7 @@
             </w:pPr>
             <w:r>
               <w:rPr>
-                <w:sz w:val="17"/>
+                <w:sz w:val="16"/>
               </w:rPr>
               <w:t>LCP: 3600.0ms (Threshold &lt;=3200ms)</w:t>
             </w:r>
@@ -869,7 +981,7 @@
         </w:tc>
         <w:tc>
           <w:tcPr>
-            <w:tcW w:type="dxa" w:w="1656"/>
+            <w:tcW w:type="dxa" w:w="1680"/>
             <w:shd w:fill="F8FAFC"/>
           </w:tcPr>
           <w:p>
@@ -878,7 +990,7 @@
             </w:pPr>
             <w:r>
               <w:rPr>
-                <w:sz w:val="17"/>
+                <w:sz w:val="16"/>
               </w:rPr>
               <w:t>Defect</w:t>
             </w:r>
@@ -886,7 +998,7 @@
         </w:tc>
         <w:tc>
           <w:tcPr>
-            <w:tcW w:type="dxa" w:w="1656"/>
+            <w:tcW w:type="dxa" w:w="1680"/>
             <w:shd w:fill="F8FAFC"/>
           </w:tcPr>
           <w:p>
@@ -895,7 +1007,7 @@
             </w:pPr>
             <w:r>
               <w:rPr>
-                <w:sz w:val="17"/>
+                <w:sz w:val="16"/>
               </w:rPr>
               <w:t>Defect</w:t>
             </w:r>
@@ -903,7 +1015,7 @@
         </w:tc>
         <w:tc>
           <w:tcPr>
-            <w:tcW w:type="dxa" w:w="1656"/>
+            <w:tcW w:type="dxa" w:w="1680"/>
             <w:shd w:fill="F8FAFC"/>
           </w:tcPr>
           <w:p>
@@ -914,7 +1026,7 @@
               <w:rPr>
                 <w:b/>
                 <w:color w:val="10B981"/>
-                <w:sz w:val="17"/>
+                <w:sz w:val="16"/>
               </w:rPr>
               <w:t>TP (Pass)</w:t>
             </w:r>
@@ -924,7 +1036,7 @@
       <w:tr>
         <w:tc>
           <w:tcPr>
-            <w:tcW w:type="dxa" w:w="1656"/>
+            <w:tcW w:type="dxa" w:w="1680"/>
             <w:shd w:fill="FFFFFF"/>
           </w:tcPr>
           <w:p>
@@ -933,7 +1045,7 @@
             </w:pPr>
             <w:r>
               <w:rPr>
-                <w:sz w:val="17"/>
+                <w:sz w:val="16"/>
               </w:rPr>
               <w:t>PERF-06</w:t>
             </w:r>
@@ -941,7 +1053,7 @@
         </w:tc>
         <w:tc>
           <w:tcPr>
-            <w:tcW w:type="dxa" w:w="1656"/>
+            <w:tcW w:type="dxa" w:w="1680"/>
             <w:shd w:fill="FFFFFF"/>
           </w:tcPr>
           <w:p>
@@ -950,7 +1062,7 @@
             </w:pPr>
             <w:r>
               <w:rPr>
-                <w:sz w:val="17"/>
+                <w:sz w:val="16"/>
               </w:rPr>
               <w:t>Unbuffered Telemetry (CLS)</w:t>
             </w:r>
@@ -958,7 +1070,7 @@
         </w:tc>
         <w:tc>
           <w:tcPr>
-            <w:tcW w:type="dxa" w:w="1656"/>
+            <w:tcW w:type="dxa" w:w="1680"/>
             <w:shd w:fill="FFFFFF"/>
           </w:tcPr>
           <w:p>
@@ -967,7 +1079,7 @@
             </w:pPr>
             <w:r>
               <w:rPr>
-                <w:sz w:val="17"/>
+                <w:sz w:val="16"/>
               </w:rPr>
               <w:t>CLS: 0.284 (Threshold &lt;=0.10)</w:t>
             </w:r>
@@ -975,7 +1087,7 @@
         </w:tc>
         <w:tc>
           <w:tcPr>
-            <w:tcW w:type="dxa" w:w="1656"/>
+            <w:tcW w:type="dxa" w:w="1680"/>
             <w:shd w:fill="FFFFFF"/>
           </w:tcPr>
           <w:p>
@@ -984,7 +1096,7 @@
             </w:pPr>
             <w:r>
               <w:rPr>
-                <w:sz w:val="17"/>
+                <w:sz w:val="16"/>
               </w:rPr>
               <w:t>Defect</w:t>
             </w:r>
@@ -992,7 +1104,7 @@
         </w:tc>
         <w:tc>
           <w:tcPr>
-            <w:tcW w:type="dxa" w:w="1656"/>
+            <w:tcW w:type="dxa" w:w="1680"/>
             <w:shd w:fill="FFFFFF"/>
           </w:tcPr>
           <w:p>
@@ -1001,7 +1113,7 @@
             </w:pPr>
             <w:r>
               <w:rPr>
-                <w:sz w:val="17"/>
+                <w:sz w:val="16"/>
               </w:rPr>
               <w:t>Defect</w:t>
             </w:r>
@@ -1009,7 +1121,7 @@
         </w:tc>
         <w:tc>
           <w:tcPr>
-            <w:tcW w:type="dxa" w:w="1656"/>
+            <w:tcW w:type="dxa" w:w="1680"/>
             <w:shd w:fill="FFFFFF"/>
           </w:tcPr>
           <w:p>
@@ -1020,7 +1132,7 @@
               <w:rPr>
                 <w:b/>
                 <w:color w:val="10B981"/>
-                <w:sz w:val="17"/>
+                <w:sz w:val="16"/>
               </w:rPr>
               <w:t>TP (Pass)</w:t>
             </w:r>
@@ -1030,7 +1142,7 @@
       <w:tr>
         <w:tc>
           <w:tcPr>
-            <w:tcW w:type="dxa" w:w="1656"/>
+            <w:tcW w:type="dxa" w:w="1680"/>
             <w:shd w:fill="F8FAFC"/>
           </w:tcPr>
           <w:p>
@@ -1039,7 +1151,7 @@
             </w:pPr>
             <w:r>
               <w:rPr>
-                <w:sz w:val="17"/>
+                <w:sz w:val="16"/>
               </w:rPr>
               <w:t>PERF-07</w:t>
             </w:r>
@@ -1047,7 +1159,7 @@
         </w:tc>
         <w:tc>
           <w:tcPr>
-            <w:tcW w:type="dxa" w:w="1656"/>
+            <w:tcW w:type="dxa" w:w="1680"/>
             <w:shd w:fill="F8FAFC"/>
           </w:tcPr>
           <w:p>
@@ -1056,7 +1168,7 @@
             </w:pPr>
             <w:r>
               <w:rPr>
-                <w:sz w:val="17"/>
+                <w:sz w:val="16"/>
               </w:rPr>
               <w:t>Blocking Telemetry Parsing</w:t>
             </w:r>
@@ -1064,7 +1176,7 @@
         </w:tc>
         <w:tc>
           <w:tcPr>
-            <w:tcW w:type="dxa" w:w="1656"/>
+            <w:tcW w:type="dxa" w:w="1680"/>
             <w:shd w:fill="F8FAFC"/>
           </w:tcPr>
           <w:p>
@@ -1073,7 +1185,7 @@
             </w:pPr>
             <w:r>
               <w:rPr>
-                <w:sz w:val="17"/>
+                <w:sz w:val="16"/>
               </w:rPr>
               <w:t>Long Task: 180.0ms UI freeze</w:t>
             </w:r>
@@ -1081,7 +1193,7 @@
         </w:tc>
         <w:tc>
           <w:tcPr>
-            <w:tcW w:type="dxa" w:w="1656"/>
+            <w:tcW w:type="dxa" w:w="1680"/>
             <w:shd w:fill="F8FAFC"/>
           </w:tcPr>
           <w:p>
@@ -1090,7 +1202,7 @@
             </w:pPr>
             <w:r>
               <w:rPr>
-                <w:sz w:val="17"/>
+                <w:sz w:val="16"/>
               </w:rPr>
               <w:t>Defect</w:t>
             </w:r>
@@ -1098,7 +1210,7 @@
         </w:tc>
         <w:tc>
           <w:tcPr>
-            <w:tcW w:type="dxa" w:w="1656"/>
+            <w:tcW w:type="dxa" w:w="1680"/>
             <w:shd w:fill="F8FAFC"/>
           </w:tcPr>
           <w:p>
@@ -1107,7 +1219,7 @@
             </w:pPr>
             <w:r>
               <w:rPr>
-                <w:sz w:val="17"/>
+                <w:sz w:val="16"/>
               </w:rPr>
               <w:t>Defect</w:t>
             </w:r>
@@ -1115,7 +1227,7 @@
         </w:tc>
         <w:tc>
           <w:tcPr>
-            <w:tcW w:type="dxa" w:w="1656"/>
+            <w:tcW w:type="dxa" w:w="1680"/>
             <w:shd w:fill="F8FAFC"/>
           </w:tcPr>
           <w:p>
@@ -1126,7 +1238,7 @@
               <w:rPr>
                 <w:b/>
                 <w:color w:val="10B981"/>
-                <w:sz w:val="17"/>
+                <w:sz w:val="16"/>
               </w:rPr>
               <w:t>TP (Pass)</w:t>
             </w:r>
@@ -1136,7 +1248,7 @@
       <w:tr>
         <w:tc>
           <w:tcPr>
-            <w:tcW w:type="dxa" w:w="1656"/>
+            <w:tcW w:type="dxa" w:w="1680"/>
             <w:shd w:fill="FFFFFF"/>
           </w:tcPr>
           <w:p>
@@ -1145,7 +1257,7 @@
             </w:pPr>
             <w:r>
               <w:rPr>
-                <w:sz w:val="17"/>
+                <w:sz w:val="16"/>
               </w:rPr>
               <w:t>PERF-08</w:t>
             </w:r>
@@ -1153,7 +1265,7 @@
         </w:tc>
         <w:tc>
           <w:tcPr>
-            <w:tcW w:type="dxa" w:w="1656"/>
+            <w:tcW w:type="dxa" w:w="1680"/>
             <w:shd w:fill="FFFFFF"/>
           </w:tcPr>
           <w:p>
@@ -1162,7 +1274,7 @@
             </w:pPr>
             <w:r>
               <w:rPr>
-                <w:sz w:val="17"/>
+                <w:sz w:val="16"/>
               </w:rPr>
               <w:t>Flight Session Memory Leak</w:t>
             </w:r>
@@ -1170,7 +1282,7 @@
         </w:tc>
         <w:tc>
           <w:tcPr>
-            <w:tcW w:type="dxa" w:w="1656"/>
+            <w:tcW w:type="dxa" w:w="1680"/>
             <w:shd w:fill="FFFFFF"/>
           </w:tcPr>
           <w:p>
@@ -1179,7 +1291,7 @@
             </w:pPr>
             <w:r>
               <w:rPr>
-                <w:sz w:val="17"/>
+                <w:sz w:val="16"/>
               </w:rPr>
               <w:t>Heap Growth: +18.45MB in 2.0s</w:t>
             </w:r>
@@ -1187,7 +1299,7 @@
         </w:tc>
         <w:tc>
           <w:tcPr>
-            <w:tcW w:type="dxa" w:w="1656"/>
+            <w:tcW w:type="dxa" w:w="1680"/>
             <w:shd w:fill="FFFFFF"/>
           </w:tcPr>
           <w:p>
@@ -1196,7 +1308,7 @@
             </w:pPr>
             <w:r>
               <w:rPr>
-                <w:sz w:val="17"/>
+                <w:sz w:val="16"/>
               </w:rPr>
               <w:t>Defect</w:t>
             </w:r>
@@ -1204,7 +1316,7 @@
         </w:tc>
         <w:tc>
           <w:tcPr>
-            <w:tcW w:type="dxa" w:w="1656"/>
+            <w:tcW w:type="dxa" w:w="1680"/>
             <w:shd w:fill="FFFFFF"/>
           </w:tcPr>
           <w:p>
@@ -1213,7 +1325,7 @@
             </w:pPr>
             <w:r>
               <w:rPr>
-                <w:sz w:val="17"/>
+                <w:sz w:val="16"/>
               </w:rPr>
               <w:t>Defect</w:t>
             </w:r>
@@ -1221,7 +1333,7 @@
         </w:tc>
         <w:tc>
           <w:tcPr>
-            <w:tcW w:type="dxa" w:w="1656"/>
+            <w:tcW w:type="dxa" w:w="1680"/>
             <w:shd w:fill="FFFFFF"/>
           </w:tcPr>
           <w:p>
@@ -1232,7 +1344,7 @@
               <w:rPr>
                 <w:b/>
                 <w:color w:val="10B981"/>
-                <w:sz w:val="17"/>
+                <w:sz w:val="16"/>
               </w:rPr>
               <w:t>TP (Pass)</w:t>
             </w:r>
@@ -1242,15 +1354,191 @@
     </w:tbl>
     <w:p>
       <w:pPr>
-        <w:spacing w:after="120"/>
+        <w:spacing w:after="160"/>
       </w:pPr>
+    </w:p>
+    <w:p>
+      <w:pPr>
+        <w:spacing w:before="120" w:after="40"/>
+        <w:jc w:val="center"/>
+      </w:pPr>
+    </w:p>
+    <w:p>
+      <w:r>
+        <w:drawing>
+          <wp:inline xmlns:a="http://schemas.openxmlformats.org/drawingml/2006/main" xmlns:pic="http://schemas.openxmlformats.org/drawingml/2006/picture">
+            <wp:extent cx="4114800" cy="4114800"/>
+            <wp:docPr id="3" name="Picture 3"/>
+            <wp:cNvGraphicFramePr>
+              <a:graphicFrameLocks noChangeAspect="1"/>
+            </wp:cNvGraphicFramePr>
+            <a:graphic>
+              <a:graphicData uri="http://schemas.openxmlformats.org/drawingml/2006/picture">
+                <pic:pic>
+                  <pic:nvPicPr>
+                    <pic:cNvPr id="0" name="level2_quality_radar_chart.png"/>
+                    <pic:cNvPicPr/>
+                  </pic:nvPicPr>
+                  <pic:blipFill>
+                    <a:blip r:embed="rId11"/>
+                    <a:stretch>
+                      <a:fillRect/>
+                    </a:stretch>
+                  </pic:blipFill>
+                  <pic:spPr>
+                    <a:xfrm>
+                      <a:off x="0" y="0"/>
+                      <a:ext cx="4114800" cy="4114800"/>
+                    </a:xfrm>
+                    <a:prstGeom prst="rect"/>
+                  </pic:spPr>
+                </pic:pic>
+              </a:graphicData>
+            </a:graphic>
+          </wp:inline>
+        </w:drawing>
+      </w:r>
+    </w:p>
+    <w:p>
+      <w:pPr>
+        <w:spacing w:after="200"/>
+        <w:jc w:val="center"/>
+      </w:pPr>
+      <w:r>
+        <w:rPr>
+          <w:i/>
+          <w:color w:val="64748B"/>
+          <w:sz w:val="17"/>
+        </w:rPr>
+        <w:t>Figure 2.2: 6-Axis Evaluation Matrix Radar Graph (100% Quality &amp; Reliability)</w:t>
+      </w:r>
     </w:p>
     <w:p>
       <w:pPr>
         <w:pStyle w:val="Heading2"/>
       </w:pPr>
       <w:r>
-        <w:t>Detailed Scenario Failure Analysis &amp; Remediation:</w:t>
+        <w:t>Visual Evidence Captured During Live Audits:</w:t>
+      </w:r>
+    </w:p>
+    <w:p>
+      <w:pPr>
+        <w:spacing w:before="80" w:after="40"/>
+        <w:jc w:val="center"/>
+      </w:pPr>
+    </w:p>
+    <w:p>
+      <w:r>
+        <w:drawing>
+          <wp:inline xmlns:a="http://schemas.openxmlformats.org/drawingml/2006/main" xmlns:pic="http://schemas.openxmlformats.org/drawingml/2006/picture">
+            <wp:extent cx="5029200" cy="2828925"/>
+            <wp:docPr id="4" name="Picture 4"/>
+            <wp:cNvGraphicFramePr>
+              <a:graphicFrameLocks noChangeAspect="1"/>
+            </wp:cNvGraphicFramePr>
+            <a:graphic>
+              <a:graphicData uri="http://schemas.openxmlformats.org/drawingml/2006/picture">
+                <pic:pic>
+                  <pic:nvPicPr>
+                    <pic:cNvPr id="0" name="defect_scenario_10_1790413702.png"/>
+                    <pic:cNvPicPr/>
+                  </pic:nvPicPr>
+                  <pic:blipFill>
+                    <a:blip r:embed="rId12"/>
+                    <a:stretch>
+                      <a:fillRect/>
+                    </a:stretch>
+                  </pic:blipFill>
+                  <pic:spPr>
+                    <a:xfrm>
+                      <a:off x="0" y="0"/>
+                      <a:ext cx="5029200" cy="2828925"/>
+                    </a:xfrm>
+                    <a:prstGeom prst="rect"/>
+                  </pic:spPr>
+                </pic:pic>
+              </a:graphicData>
+            </a:graphic>
+          </wp:inline>
+        </w:drawing>
+      </w:r>
+    </w:p>
+    <w:p>
+      <w:pPr>
+        <w:spacing w:after="160"/>
+        <w:jc w:val="center"/>
+      </w:pPr>
+      <w:r>
+        <w:rPr>
+          <w:i/>
+          <w:color w:val="64748B"/>
+          <w:sz w:val="16"/>
+        </w:rPr>
+        <w:t>Figure 2.3: High-Resolution Visual Proof — Invariant &amp; Layout Verification (defect_scenario_10_1790413702.png)</w:t>
+      </w:r>
+    </w:p>
+    <w:p>
+      <w:pPr>
+        <w:spacing w:before="80" w:after="40"/>
+        <w:jc w:val="center"/>
+      </w:pPr>
+    </w:p>
+    <w:p>
+      <w:r>
+        <w:drawing>
+          <wp:inline xmlns:a="http://schemas.openxmlformats.org/drawingml/2006/main" xmlns:pic="http://schemas.openxmlformats.org/drawingml/2006/picture">
+            <wp:extent cx="5029200" cy="2828925"/>
+            <wp:docPr id="5" name="Picture 5"/>
+            <wp:cNvGraphicFramePr>
+              <a:graphicFrameLocks noChangeAspect="1"/>
+            </wp:cNvGraphicFramePr>
+            <a:graphic>
+              <a:graphicData uri="http://schemas.openxmlformats.org/drawingml/2006/picture">
+                <pic:pic>
+                  <pic:nvPicPr>
+                    <pic:cNvPr id="0" name="defect_scenario_10_1790415756.png"/>
+                    <pic:cNvPicPr/>
+                  </pic:nvPicPr>
+                  <pic:blipFill>
+                    <a:blip r:embed="rId13"/>
+                    <a:stretch>
+                      <a:fillRect/>
+                    </a:stretch>
+                  </pic:blipFill>
+                  <pic:spPr>
+                    <a:xfrm>
+                      <a:off x="0" y="0"/>
+                      <a:ext cx="5029200" cy="2828925"/>
+                    </a:xfrm>
+                    <a:prstGeom prst="rect"/>
+                  </pic:spPr>
+                </pic:pic>
+              </a:graphicData>
+            </a:graphic>
+          </wp:inline>
+        </w:drawing>
+      </w:r>
+    </w:p>
+    <w:p>
+      <w:pPr>
+        <w:spacing w:after="160"/>
+        <w:jc w:val="center"/>
+      </w:pPr>
+      <w:r>
+        <w:rPr>
+          <w:i/>
+          <w:color w:val="64748B"/>
+          <w:sz w:val="16"/>
+        </w:rPr>
+        <w:t>Figure 2.4: High-Resolution Visual Proof — Invariant &amp; Layout Verification (defect_scenario_10_1790415756.png)</w:t>
+      </w:r>
+    </w:p>
+    <w:p>
+      <w:pPr>
+        <w:pStyle w:val="Heading2"/>
+      </w:pPr>
+      <w:r>
+        <w:t>Scenario Root-Cause Remediation Details:</w:t>
       </w:r>
     </w:p>
     <w:p>
@@ -1333,225 +1621,9 @@
         <w:t>Observed: +18.45MB heap accumulation in 2.0s. Cause: Retained WebSocket event listeners and uncollected 3D polyline geometries. Impact: Browser tab crash during prolonged multi-hour flight missions. Remediation: Implement circular telemetry buffers and dispose geometries on component unmount.</w:t>
       </w:r>
     </w:p>
-    <w:p>
-      <w:pPr>
-        <w:pStyle w:val="Heading2"/>
-      </w:pPr>
-      <w:r>
-        <w:t>Evaluation Quality Metrics:</w:t>
-      </w:r>
-    </w:p>
-    <w:tbl>
-      <w:tblPr>
-        <w:tblW w:type="auto" w:w="0"/>
-        <w:jc w:val="center"/>
-        <w:tblLook w:firstColumn="1" w:firstRow="1" w:lastColumn="0" w:lastRow="0" w:noHBand="0" w:noVBand="1" w:val="04A0"/>
-      </w:tblPr>
-      <w:tblGrid>
-        <w:gridCol w:w="1987"/>
-        <w:gridCol w:w="1987"/>
-        <w:gridCol w:w="1987"/>
-        <w:gridCol w:w="1987"/>
-        <w:gridCol w:w="1987"/>
-      </w:tblGrid>
-      <w:tr>
-        <w:tc>
-          <w:tcPr>
-            <w:tcW w:type="dxa" w:w="1987"/>
-            <w:shd w:fill="0F172A"/>
-          </w:tcPr>
-          <w:p>
-            <w:pPr>
-              <w:spacing w:after="40"/>
-            </w:pPr>
-            <w:r>
-              <w:rPr>
-                <w:b/>
-                <w:color w:val="F8FAFC"/>
-                <w:sz w:val="18"/>
-              </w:rPr>
-              <w:t>Precision</w:t>
-            </w:r>
-          </w:p>
-        </w:tc>
-        <w:tc>
-          <w:tcPr>
-            <w:tcW w:type="dxa" w:w="1987"/>
-            <w:shd w:fill="0F172A"/>
-          </w:tcPr>
-          <w:p>
-            <w:pPr>
-              <w:spacing w:after="40"/>
-            </w:pPr>
-            <w:r>
-              <w:rPr>
-                <w:b/>
-                <w:color w:val="F8FAFC"/>
-                <w:sz w:val="18"/>
-              </w:rPr>
-              <w:t>Recall</w:t>
-            </w:r>
-          </w:p>
-        </w:tc>
-        <w:tc>
-          <w:tcPr>
-            <w:tcW w:type="dxa" w:w="1987"/>
-            <w:shd w:fill="0F172A"/>
-          </w:tcPr>
-          <w:p>
-            <w:pPr>
-              <w:spacing w:after="40"/>
-            </w:pPr>
-            <w:r>
-              <w:rPr>
-                <w:b/>
-                <w:color w:val="F8FAFC"/>
-                <w:sz w:val="18"/>
-              </w:rPr>
-              <w:t>Accuracy</w:t>
-            </w:r>
-          </w:p>
-        </w:tc>
-        <w:tc>
-          <w:tcPr>
-            <w:tcW w:type="dxa" w:w="1987"/>
-            <w:shd w:fill="0F172A"/>
-          </w:tcPr>
-          <w:p>
-            <w:pPr>
-              <w:spacing w:after="40"/>
-            </w:pPr>
-            <w:r>
-              <w:rPr>
-                <w:b/>
-                <w:color w:val="F8FAFC"/>
-                <w:sz w:val="18"/>
-              </w:rPr>
-              <w:t>F1-Score</w:t>
-            </w:r>
-          </w:p>
-        </w:tc>
-        <w:tc>
-          <w:tcPr>
-            <w:tcW w:type="dxa" w:w="1987"/>
-            <w:shd w:fill="0F172A"/>
-          </w:tcPr>
-          <w:p>
-            <w:pPr>
-              <w:spacing w:after="40"/>
-            </w:pPr>
-            <w:r>
-              <w:rPr>
-                <w:b/>
-                <w:color w:val="F8FAFC"/>
-                <w:sz w:val="18"/>
-              </w:rPr>
-              <w:t>Runtime</w:t>
-            </w:r>
-          </w:p>
-        </w:tc>
-      </w:tr>
-      <w:tr>
-        <w:tc>
-          <w:tcPr>
-            <w:tcW w:type="dxa" w:w="1987"/>
-            <w:shd w:fill="F1F5F9"/>
-          </w:tcPr>
-          <w:p>
-            <w:pPr>
-              <w:spacing w:after="40"/>
-            </w:pPr>
-            <w:r>
-              <w:rPr>
-                <w:b/>
-                <w:color w:val="10B981"/>
-                <w:sz w:val="18"/>
-              </w:rPr>
-              <w:t>100.0% (1.0000)</w:t>
-            </w:r>
-          </w:p>
-        </w:tc>
-        <w:tc>
-          <w:tcPr>
-            <w:tcW w:type="dxa" w:w="1987"/>
-            <w:shd w:fill="F1F5F9"/>
-          </w:tcPr>
-          <w:p>
-            <w:pPr>
-              <w:spacing w:after="40"/>
-            </w:pPr>
-            <w:r>
-              <w:rPr>
-                <w:b/>
-                <w:color w:val="10B981"/>
-                <w:sz w:val="18"/>
-              </w:rPr>
-              <w:t>100.0% (1.0000)</w:t>
-            </w:r>
-          </w:p>
-        </w:tc>
-        <w:tc>
-          <w:tcPr>
-            <w:tcW w:type="dxa" w:w="1987"/>
-            <w:shd w:fill="F1F5F9"/>
-          </w:tcPr>
-          <w:p>
-            <w:pPr>
-              <w:spacing w:after="40"/>
-            </w:pPr>
-            <w:r>
-              <w:rPr>
-                <w:b/>
-                <w:color w:val="10B981"/>
-                <w:sz w:val="18"/>
-              </w:rPr>
-              <w:t>100.0% (1.0000)</w:t>
-            </w:r>
-          </w:p>
-        </w:tc>
-        <w:tc>
-          <w:tcPr>
-            <w:tcW w:type="dxa" w:w="1987"/>
-            <w:shd w:fill="F1F5F9"/>
-          </w:tcPr>
-          <w:p>
-            <w:pPr>
-              <w:spacing w:after="40"/>
-            </w:pPr>
-            <w:r>
-              <w:rPr>
-                <w:b/>
-                <w:color w:val="10B981"/>
-                <w:sz w:val="18"/>
-              </w:rPr>
-              <w:t>100.0% (1.0000)</w:t>
-            </w:r>
-          </w:p>
-        </w:tc>
-        <w:tc>
-          <w:tcPr>
-            <w:tcW w:type="dxa" w:w="1987"/>
-            <w:shd w:fill="F1F5F9"/>
-          </w:tcPr>
-          <w:p>
-            <w:pPr>
-              <w:spacing w:after="40"/>
-            </w:pPr>
-            <w:r>
-              <w:rPr>
-                <w:b/>
-                <w:color w:val="0284C7"/>
-                <w:sz w:val="18"/>
-              </w:rPr>
-              <w:t>27.46s (8 vectors)</w:t>
-            </w:r>
-          </w:p>
-        </w:tc>
-      </w:tr>
-    </w:tbl>
     <w:sectPr>
       <w:pgSz w:w="12240" w:h="15840"/>
-      <w:pgMar w:top="1152" w:right="1152" w:bottom="1152" w:left="1152" w:header="720" w:footer="720" w:gutter="0"/>
+      <w:pgMar w:top="1080" w:right="1080" w:bottom="1080" w:left="1080" w:header="720" w:footer="720" w:gutter="0"/>
       <w:cols w:space="720"/>
       <w:docGrid w:linePitch="360"/>
     </w:sectPr>

</xml_diff>